<commit_message>
Condense resume to one page
Tighter A4 margins/fonts/spacing and a bullet-per-role cap (default 4) so
tailored resumes stay one page. Regenerated the two already-queued resumes
with the new layout and documented the option in the tailoring spec.

Co-Authored-By: Claude Sonnet 5 <noreply@anthropic.com>
</commit_message>
<xml_diff>
--- a/data/queue/crashplan-senior-java-developer-04887009/tailored_resume.docx
+++ b/data/queue/crashplan-senior-java-developer-04887009/tailored_resume.docx
@@ -5,72 +5,112 @@
     <w:p>
       <w:pPr>
         <w:pStyle w:val="Title"/>
+        <w:spacing w:after="20" w:before="0" w:line="240" w:lineRule="auto"/>
         <w:jc w:val="center"/>
       </w:pPr>
       <w:r>
+        <w:rPr>
+          <w:sz w:val="36"/>
+        </w:rPr>
         <w:t>Mahendra Kumar</w:t>
       </w:r>
     </w:p>
     <w:p>
       <w:pPr>
+        <w:spacing w:after="120" w:before="0" w:line="240" w:lineRule="auto"/>
         <w:jc w:val="center"/>
       </w:pPr>
       <w:r>
+        <w:rPr>
+          <w:sz w:val="19"/>
+        </w:rPr>
         <w:t>+91 9523300107 | workwithmahendrakumar@gmail.com</w:t>
       </w:r>
     </w:p>
     <w:p>
       <w:pPr>
         <w:pStyle w:val="Heading1"/>
+        <w:spacing w:after="40" w:before="120" w:line="240" w:lineRule="auto"/>
       </w:pPr>
       <w:r>
+        <w:rPr>
+          <w:sz w:val="23"/>
+        </w:rPr>
         <w:t>Professional Summary</w:t>
       </w:r>
     </w:p>
     <w:p>
+      <w:pPr>
+        <w:spacing w:after="40" w:before="0" w:line="240" w:lineRule="auto"/>
+      </w:pPr>
       <w:r>
-        <w:t>Senior Backend Engineer with 6+ years building scalable, high-availability distributed systems in Java and Spring Boot, including event-driven microservices with Apache Kafka and RESTful APIs on AWS. Experienced ensuring reliability, idempotency, and ACID guarantees for high-throughput production systems, with a strong foundation in performance tuning and cloud-native architecture.</w:t>
+        <w:t>Senior Java engineer with 6+ years building high-availability, event-driven microservices (Spring Boot, Kafka) with strong reliability guarantees (idempotency, ACID), plus hands-on AWS and Terraform-managed cloud infrastructure.</w:t>
       </w:r>
     </w:p>
     <w:p>
       <w:pPr>
         <w:pStyle w:val="Heading1"/>
+        <w:spacing w:after="40" w:before="120" w:line="240" w:lineRule="auto"/>
       </w:pPr>
       <w:r>
+        <w:rPr>
+          <w:sz w:val="23"/>
+        </w:rPr>
         <w:t>Technical Skills</w:t>
       </w:r>
     </w:p>
     <w:p>
+      <w:pPr>
+        <w:spacing w:after="40" w:before="0" w:line="240" w:lineRule="auto"/>
+      </w:pPr>
       <w:r>
         <w:t>Languages: Java, Python (scripting), C#, Bash/Shell, Go (familiar)</w:t>
       </w:r>
     </w:p>
     <w:p>
+      <w:pPr>
+        <w:spacing w:after="40" w:before="0" w:line="240" w:lineRule="auto"/>
+      </w:pPr>
       <w:r>
-        <w:t>Frameworks: Spring Boot, REST APIs, Spring Cloud, Spring Security, .NET Core, .NET MVC</w:t>
+        <w:t>Frameworks: Spring Boot, Spring Cloud, Spring Security, REST APIs, .NET Core, .NET MVC</w:t>
       </w:r>
     </w:p>
     <w:p>
+      <w:pPr>
+        <w:spacing w:after="40" w:before="0" w:line="240" w:lineRule="auto"/>
+      </w:pPr>
       <w:r>
-        <w:t>Distributed Systems: Microservices, Apache Kafka, event-driven architecture, idempotency, ACID guarantees</w:t>
+        <w:t>Distributed Systems: Apache Kafka, Microservices, event-driven architecture, idempotency, ACID guarantees</w:t>
       </w:r>
     </w:p>
     <w:p>
+      <w:pPr>
+        <w:spacing w:after="40" w:before="0" w:line="240" w:lineRule="auto"/>
+      </w:pPr>
       <w:r>
         <w:t>Cloud &amp; Infrastructure: AWS (EC2, RDS, DMS, S3, CloudWatch), Terraform (IaC), Docker, Kubernetes, CI/CD</w:t>
       </w:r>
     </w:p>
     <w:p>
+      <w:pPr>
+        <w:spacing w:after="40" w:before="0" w:line="240" w:lineRule="auto"/>
+      </w:pPr>
       <w:r>
         <w:t>Databases: PostgreSQL, MS-SQL Server (query optimization, debugging, performance tuning)</w:t>
       </w:r>
     </w:p>
     <w:p>
+      <w:pPr>
+        <w:spacing w:after="40" w:before="0" w:line="240" w:lineRule="auto"/>
+      </w:pPr>
       <w:r>
         <w:t>Tooling &amp; Practices: Git/GitHub, JIRA, Agile/Scrum, TDD (JUnit, 92%+ coverage), Code Reviews, Linux</w:t>
       </w:r>
     </w:p>
     <w:p>
+      <w:pPr>
+        <w:spacing w:after="40" w:before="0" w:line="240" w:lineRule="auto"/>
+      </w:pPr>
       <w:r>
         <w:t>AI: RAG, Agentic AI, MCP, HuggingFace, OpenAI API integration</w:t>
       </w:r>
@@ -78,22 +118,24 @@
     <w:p>
       <w:pPr>
         <w:pStyle w:val="Heading1"/>
+        <w:spacing w:after="40" w:before="120" w:line="240" w:lineRule="auto"/>
       </w:pPr>
       <w:r>
+        <w:rPr>
+          <w:sz w:val="23"/>
+        </w:rPr>
         <w:t>Experience</w:t>
       </w:r>
     </w:p>
     <w:p>
+      <w:pPr>
+        <w:spacing w:after="40" w:before="80" w:line="240" w:lineRule="auto"/>
+      </w:pPr>
       <w:r>
         <w:rPr>
           <w:b/>
         </w:rPr>
-        <w:t>Senior Backend Engineer — Standard Chartered Bank (via Capgemini)</w:t>
-      </w:r>
-    </w:p>
-    <w:p>
-      <w:r>
-        <w:t>2024-05 to present</w:t>
+        <w:t>Senior Backend Engineer — Standard Chartered Bank (via Capgemini) (2024-05 to present)</w:t>
       </w:r>
     </w:p>
     <w:p>
@@ -129,16 +171,22 @@
       </w:r>
     </w:p>
     <w:p>
+      <w:pPr>
+        <w:spacing w:after="40" w:before="80" w:line="240" w:lineRule="auto"/>
+      </w:pPr>
       <w:r>
         <w:rPr>
           <w:b/>
         </w:rPr>
-        <w:t>Software Development Engineer - Backend — eShakti</w:t>
+        <w:t>Software Development Engineer - Backend — eShakti (2021-11 to 2024-05)</w:t>
       </w:r>
     </w:p>
     <w:p>
+      <w:pPr>
+        <w:pStyle w:val="ListBullet"/>
+      </w:pPr>
       <w:r>
-        <w:t>2021-11 to 2024-05</w:t>
+        <w:t>Owned and developed a complete feature set for an in-house distributed platform (Tools-MVC) serving billing, logistics, fabric, and finance teams, engaging with stakeholders to define scope, timelines, and delivery commitments.</w:t>
       </w:r>
     </w:p>
     <w:p>
@@ -162,28 +210,18 @@
         <w:pStyle w:val="ListBullet"/>
       </w:pPr>
       <w:r>
-        <w:t>Owned and developed a complete feature set for an in-house distributed platform (Tools-MVC) serving billing, logistics, fabric, and finance teams, engaging with stakeholders to define scope, timelines, and delivery commitments.</w:t>
+        <w:t>Diagnosed and resolved complex functional and performance defects across the distributed system, collaborating with QA and support teams to reproduce issues, implement fixes, and deliver patches with rapid turnaround.</w:t>
       </w:r>
     </w:p>
     <w:p>
       <w:pPr>
-        <w:pStyle w:val="ListBullet"/>
+        <w:spacing w:after="40" w:before="80" w:line="240" w:lineRule="auto"/>
       </w:pPr>
-      <w:r>
-        <w:t>Diagnosed and resolved complex functional and performance defects across the distributed system, collaborating with QA and support teams to reproduce issues, implement fixes, and deliver patches with rapid turnaround.</w:t>
-      </w:r>
-    </w:p>
-    <w:p>
       <w:r>
         <w:rPr>
           <w:b/>
         </w:rPr>
-        <w:t>Software Engineer — Oracle Cerner</w:t>
-      </w:r>
-    </w:p>
-    <w:p>
-      <w:r>
-        <w:t>2019-09 to 2021-06</w:t>
+        <w:t>Software Engineer — Oracle Cerner (2019-09 to 2021-06)</w:t>
       </w:r>
     </w:p>
     <w:p>
@@ -205,12 +243,19 @@
     <w:p>
       <w:pPr>
         <w:pStyle w:val="Heading1"/>
+        <w:spacing w:after="40" w:before="120" w:line="240" w:lineRule="auto"/>
       </w:pPr>
       <w:r>
+        <w:rPr>
+          <w:sz w:val="23"/>
+        </w:rPr>
         <w:t>Open Source Contributions</w:t>
       </w:r>
     </w:p>
     <w:p>
+      <w:pPr>
+        <w:spacing w:after="40" w:before="0" w:line="240" w:lineRule="auto"/>
+      </w:pPr>
       <w:r>
         <w:rPr>
           <w:b/>
@@ -237,12 +282,19 @@
     <w:p>
       <w:pPr>
         <w:pStyle w:val="Heading1"/>
+        <w:spacing w:after="40" w:before="120" w:line="240" w:lineRule="auto"/>
       </w:pPr>
       <w:r>
+        <w:rPr>
+          <w:sz w:val="23"/>
+        </w:rPr>
         <w:t>Achievements &amp; Awards</w:t>
       </w:r>
     </w:p>
     <w:p>
+      <w:pPr>
+        <w:spacing w:after="40" w:before="0" w:line="240" w:lineRule="auto"/>
+      </w:pPr>
       <w:r>
         <w:rPr>
           <w:b/>
@@ -254,6 +306,9 @@
       </w:r>
     </w:p>
     <w:p>
+      <w:pPr>
+        <w:spacing w:after="40" w:before="0" w:line="240" w:lineRule="auto"/>
+      </w:pPr>
       <w:r>
         <w:rPr>
           <w:b/>
@@ -267,19 +322,26 @@
     <w:p>
       <w:pPr>
         <w:pStyle w:val="Heading1"/>
+        <w:spacing w:after="40" w:before="120" w:line="240" w:lineRule="auto"/>
       </w:pPr>
       <w:r>
+        <w:rPr>
+          <w:sz w:val="23"/>
+        </w:rPr>
         <w:t>Education</w:t>
       </w:r>
     </w:p>
     <w:p>
+      <w:pPr>
+        <w:spacing w:after="40" w:before="0" w:line="240" w:lineRule="auto"/>
+      </w:pPr>
       <w:r>
         <w:t>Sri Jayachamarajendra College of Engineering, Mysuru — B.E. in Information Science (2015-2019)</w:t>
       </w:r>
     </w:p>
     <w:sectPr>
-      <w:pgSz w:w="12240" w:h="15840"/>
-      <w:pgMar w:top="1440" w:right="1800" w:bottom="1440" w:left="1800" w:header="720" w:footer="720" w:gutter="0"/>
+      <w:pgSz w:w="11906" w:h="16838"/>
+      <w:pgMar w:top="720" w:right="850" w:bottom="720" w:left="850" w:header="720" w:footer="720" w:gutter="0"/>
       <w:cols w:space="720"/>
       <w:docGrid w:linePitch="360"/>
     </w:sectPr>
@@ -650,9 +712,12 @@
     <w:name w:val="Normal"/>
     <w:qFormat/>
     <w:rsid w:val="00FC693F"/>
+    <w:pPr>
+      <w:spacing w:after="40" w:before="0" w:line="240" w:lineRule="auto"/>
+    </w:pPr>
     <w:rPr>
       <w:rFonts w:ascii="Calibri" w:hAnsi="Calibri"/>
-      <w:sz w:val="21"/>
+      <w:sz w:val="20"/>
     </w:rPr>
   </w:style>
   <w:style w:type="paragraph" w:styleId="Header">
@@ -1181,8 +1246,13 @@
       <w:numPr>
         <w:numId w:val="1"/>
       </w:numPr>
+      <w:spacing w:after="20" w:before="0" w:line="240" w:lineRule="auto"/>
       <w:contextualSpacing/>
     </w:pPr>
+    <w:rPr>
+      <w:rFonts w:ascii="Calibri" w:hAnsi="Calibri"/>
+      <w:sz w:val="19"/>
+    </w:rPr>
   </w:style>
   <w:style w:type="paragraph" w:styleId="ListBullet2">
     <w:name w:val="List Bullet 2"/>

</xml_diff>

<commit_message>
Add clickable hyperlinks for PR references and profile links
Contact line's LinkedIn/GitHub and the JabRef PR references (#9925,
#13266) now render as real clickable hyperlinks in the DOCX output, so
anyone reviewing the resume can jump straight to the PRs. Regenerated
both queued tailored resumes with the new links.

Co-Authored-By: Claude Sonnet 5 <noreply@anthropic.com>
</commit_message>
<xml_diff>
--- a/data/queue/crashplan-senior-java-developer-04887009/tailored_resume.docx
+++ b/data/queue/crashplan-senior-java-developer-04887009/tailored_resume.docx
@@ -24,7 +24,19 @@
         <w:rPr>
           <w:sz w:val="19"/>
         </w:rPr>
-        <w:t>+91 9523300107 | workwithmahendrakumar@gmail.com</w:t>
+        <w:t>+91 9523300107</w:t>
+      </w:r>
+      <w:r>
+        <w:rPr>
+          <w:sz w:val="19"/>
+        </w:rPr>
+        <w:t xml:space="preserve"> | </w:t>
+      </w:r>
+      <w:r>
+        <w:rPr>
+          <w:sz w:val="19"/>
+        </w:rPr>
+        <w:t>workwithmahendrakumar@gmail.com</w:t>
       </w:r>
     </w:p>
     <w:p>
@@ -256,11 +268,22 @@
       <w:pPr>
         <w:spacing w:after="40" w:before="0" w:line="240" w:lineRule="auto"/>
       </w:pPr>
+      <w:hyperlink r:id="rId9">
+        <w:r>
+          <w:rPr>
+            <w:color w:val="1155CC"/>
+            <w:u w:val="single"/>
+            <w:sz w:val="20"/>
+            <w:b/>
+          </w:rPr>
+          <w:t>JabRef - Open Source Reference and Citation Manager (4K+ GitHub Stars)</w:t>
+        </w:r>
+      </w:hyperlink>
       <w:r>
         <w:rPr>
           <w:b/>
         </w:rPr>
-        <w:t>JabRef - Open Source Reference and Citation Manager (4K+ GitHub Stars) — Contributor</w:t>
+        <w:t xml:space="preserve"> — Contributor</w:t>
       </w:r>
     </w:p>
     <w:p>
@@ -270,6 +293,32 @@
       <w:r>
         <w:t>Active contributor to JabRef, a widely-used open-source reference manager, delivered user-facing features and critical bug fixes including linked identifier icon implementation and tooltip rendering on empty rows (PRs #9925, #13266).</w:t>
       </w:r>
+      <w:r>
+        <w:t xml:space="preserve"> </w:t>
+      </w:r>
+      <w:hyperlink r:id="rId10">
+        <w:r>
+          <w:rPr>
+            <w:color w:val="1155CC"/>
+            <w:u w:val="single"/>
+            <w:sz w:val="19"/>
+          </w:rPr>
+          <w:t>PR #9925</w:t>
+        </w:r>
+      </w:hyperlink>
+      <w:r>
+        <w:t xml:space="preserve"> </w:t>
+      </w:r>
+      <w:hyperlink r:id="rId11">
+        <w:r>
+          <w:rPr>
+            <w:color w:val="1155CC"/>
+            <w:u w:val="single"/>
+            <w:sz w:val="19"/>
+          </w:rPr>
+          <w:t>PR #13266</w:t>
+        </w:r>
+      </w:hyperlink>
     </w:p>
     <w:p>
       <w:pPr>

</xml_diff>

<commit_message>
Fill in LinkedIn/GitHub profile URLs
Contact links were placeholders until now; resumes will render them as
clickable hyperlinks going forward. Regenerated both queued tailored
resumes.

Co-Authored-By: Claude Sonnet 5 <noreply@anthropic.com>
</commit_message>
<xml_diff>
--- a/data/queue/crashplan-senior-java-developer-04887009/tailored_resume.docx
+++ b/data/queue/crashplan-senior-java-developer-04887009/tailored_resume.docx
@@ -38,6 +38,38 @@
         </w:rPr>
         <w:t>workwithmahendrakumar@gmail.com</w:t>
       </w:r>
+      <w:r>
+        <w:rPr>
+          <w:sz w:val="19"/>
+        </w:rPr>
+        <w:t xml:space="preserve"> | </w:t>
+      </w:r>
+      <w:hyperlink r:id="rId9">
+        <w:r>
+          <w:rPr>
+            <w:color w:val="1155CC"/>
+            <w:u w:val="single"/>
+            <w:sz w:val="19"/>
+          </w:rPr>
+          <w:t>https://www.linkedin.com/in/mahendrakumar09</w:t>
+        </w:r>
+      </w:hyperlink>
+      <w:r>
+        <w:rPr>
+          <w:sz w:val="19"/>
+        </w:rPr>
+        <w:t xml:space="preserve"> | </w:t>
+      </w:r>
+      <w:hyperlink r:id="rId10">
+        <w:r>
+          <w:rPr>
+            <w:color w:val="1155CC"/>
+            <w:u w:val="single"/>
+            <w:sz w:val="19"/>
+          </w:rPr>
+          <w:t>https://www.github.com/mkumar09</w:t>
+        </w:r>
+      </w:hyperlink>
     </w:p>
     <w:p>
       <w:pPr>
@@ -268,7 +300,7 @@
       <w:pPr>
         <w:spacing w:after="40" w:before="0" w:line="240" w:lineRule="auto"/>
       </w:pPr>
-      <w:hyperlink r:id="rId9">
+      <w:hyperlink r:id="rId11">
         <w:r>
           <w:rPr>
             <w:color w:val="1155CC"/>
@@ -296,7 +328,7 @@
       <w:r>
         <w:t xml:space="preserve"> </w:t>
       </w:r>
-      <w:hyperlink r:id="rId10">
+      <w:hyperlink r:id="rId12">
         <w:r>
           <w:rPr>
             <w:color w:val="1155CC"/>
@@ -309,7 +341,7 @@
       <w:r>
         <w:t xml:space="preserve"> </w:t>
       </w:r>
-      <w:hyperlink r:id="rId11">
+      <w:hyperlink r:id="rId13">
         <w:r>
           <w:rPr>
             <w:color w:val="1155CC"/>

</xml_diff>